<commit_message>
docs(fase2): abstract, conclusiones y reflexiones en ingles
Los tres apartados que exigen ambas rubricas y que faltaban: abstract en
ingles y espanol, conclusiones individuales solo en ingles y reflexion
solo en ingles, una por integrante.

Las conclusiones son del proyecto y las reflexiones son personales, que
es la distincion que pide el formato de informe tecnico. Cada integrante
escribe sobre lo que efectivamente construyo.

Con esto el indicador 8 de la autoevaluacion deja de estar en No logrado
y pasa a Completamente logrado. Siguen en Logrado el 5 (falta la
bibliografia) y el 6 (faltan portada e indice).
</commit_message>
<xml_diff>
--- a/Fase 2/Evidencias_Individuales/Padron_Jossue_2.2_APT122_AutoevaluacionAvanceFase2.docx
+++ b/Fase 2/Evidencias_Individuales/Padron_Jossue_2.2_APT122_AutoevaluacionAvanceFase2.docx
@@ -7853,7 +7853,16 @@
           <w:tcPr>
             <w:tcW w:w="2460" w:type="dxa"/>
             <w:vAlign w:val="center"/>
-          </w:tcPr>
+            <w:shd w:val="clear" w:color="auto" w:fill="D9E2F3"/>
+          </w:tcPr>
+          <w:p>
+            <w:r>
+              <w:rPr>
+                <w:b/>
+              </w:rPr>
+              <w:t>◄ MI AUTOEVALUACIÓN</w:t>
+            </w:r>
+          </w:p>
           <w:p>
             <w:pPr>
               <w:rPr>
@@ -7921,16 +7930,7 @@
           <w:tcPr>
             <w:tcW w:w="2140" w:type="dxa"/>
             <w:vAlign w:val="center"/>
-            <w:shd w:val="clear" w:color="auto" w:fill="D9E2F3"/>
-          </w:tcPr>
-          <w:p>
-            <w:r>
-              <w:rPr>
-                <w:b/>
-              </w:rPr>
-              <w:t>◄ MI AUTOEVALUACIÓN</w:t>
-            </w:r>
-          </w:p>
+          </w:tcPr>
           <w:p>
             <w:pPr>
               <w:rPr>

</xml_diff>